<commit_message>
In my own words
</commit_message>
<xml_diff>
--- a/Traditional-Rag-V1/Notes_related_project.docx
+++ b/Traditional-Rag-V1/Notes_related_project.docx
@@ -3,7 +3,187 @@
 <w:document xmlns:wpc="http://schemas.microsoft.com/office/word/2010/wordprocessingCanvas" xmlns:cx="http://schemas.microsoft.com/office/drawing/2014/chartex" xmlns:cx1="http://schemas.microsoft.com/office/drawing/2015/9/8/chartex" xmlns:cx2="http://schemas.microsoft.com/office/drawing/2015/10/21/chartex" xmlns:cx3="http://schemas.microsoft.com/office/drawing/2016/5/9/chartex" xmlns:cx4="http://schemas.microsoft.com/office/drawing/2016/5/10/chartex" xmlns:cx5="http://schemas.microsoft.com/office/drawing/2016/5/11/chartex" xmlns:cx6="http://schemas.microsoft.com/office/drawing/2016/5/12/chartex" xmlns:cx7="http://schemas.microsoft.com/office/drawing/2016/5/13/chartex" xmlns:cx8="http://schemas.microsoft.com/office/drawing/2016/5/14/chartex" xmlns:mc="http://schemas.openxmlformats.org/markup-compatibility/2006" xmlns:aink="http://schemas.microsoft.com/office/drawing/2016/ink" xmlns:am3d="http://schemas.microsoft.com/office/drawing/2017/model3d" xmlns:o="urn:schemas-microsoft-com:office:office" xmlns:oel="http://schemas.microsoft.com/office/2019/extlst" xmlns:r="http://schemas.openxmlformats.org/officeDocument/2006/relationships" xmlns:m="http://schemas.openxmlformats.org/officeDocument/2006/math" xmlns:v="urn:schemas-microsoft-com:vml" xmlns:wp14="http://schemas.microsoft.com/office/word/2010/wordprocessingDrawing" xmlns:wp="http://schemas.openxmlformats.org/drawingml/2006/wordprocessingDrawing" xmlns:w10="urn:schemas-microsoft-com:office:word" xmlns:w="http://schemas.openxmlformats.org/wordprocessingml/2006/main" xmlns:w14="http://schemas.microsoft.com/office/word/2010/wordml" xmlns:w15="http://schemas.microsoft.com/office/word/2012/wordml" xmlns:w16cex="http://schemas.microsoft.com/office/word/2018/wordml/cex" xmlns:w16cid="http://schemas.microsoft.com/office/word/2016/wordml/cid" xmlns:w16="http://schemas.microsoft.com/office/word/2018/wordml" xmlns:w16du="http://schemas.microsoft.com/office/word/2023/wordml/word16du" xmlns:w16sdtdh="http://schemas.microsoft.com/office/word/2020/wordml/sdtdatahash" xmlns:w16sdtfl="http://schemas.microsoft.com/office/word/2024/wordml/sdtformatlock" xmlns:w16se="http://schemas.microsoft.com/office/word/2015/wordml/symex" xmlns:wpg="http://schemas.microsoft.com/office/word/2010/wordprocessingGroup" xmlns:wpi="http://schemas.microsoft.com/office/word/2010/wordprocessingInk" xmlns:wne="http://schemas.microsoft.com/office/word/2006/wordml" xmlns:wps="http://schemas.microsoft.com/office/word/2010/wordprocessingShape" mc:Ignorable="w14 w15 w16se w16cid w16 w16cex w16sdtdh w16sdtfl w16du wp14">
   <w:body>
     <w:p>
-      <w:r>
+      <w:pPr>
+        <w:rPr>
+          <w:sz w:val="28"/>
+          <w:szCs w:val="28"/>
+        </w:rPr>
+      </w:pPr>
+      <w:r>
+        <w:rPr>
+          <w:sz w:val="28"/>
+          <w:szCs w:val="28"/>
+          <w:highlight w:val="yellow"/>
+        </w:rPr>
+        <w:t>In Own words:--</w:t>
+      </w:r>
+    </w:p>
+    <w:p>
+      <w:r>
+        <w:rPr>
+          <w:b/>
+          <w:bCs/>
+        </w:rPr>
+        <w:t>Data</w:t>
+      </w:r>
+      <w:r>
+        <w:t>:- Pdf</w:t>
+      </w:r>
+    </w:p>
+    <w:p>
+      <w:r>
+        <w:rPr>
+          <w:b/>
+          <w:bCs/>
+        </w:rPr>
+        <w:t>Token:–</w:t>
+      </w:r>
+      <w:r>
+        <w:t xml:space="preserve"> is the smallest unit of text maybe a word / character/letters </w:t>
+      </w:r>
+    </w:p>
+    <w:p>
+      <w:r>
+        <w:rPr>
+          <w:b/>
+          <w:bCs/>
+        </w:rPr>
+        <w:t>Chunking:</w:t>
+      </w:r>
+      <w:r>
+        <w:t>-  T</w:t>
+      </w:r>
+      <w:r>
+        <w:t>he process of breaking large documents or datasets into smaller, manageable segments of text (chunks</w:t>
+      </w:r>
+      <w:r>
+        <w:t>)</w:t>
+      </w:r>
+    </w:p>
+    <w:p>
+      <w:pPr>
+        <w:rPr>
+          <w:b/>
+          <w:bCs/>
+        </w:rPr>
+      </w:pPr>
+      <w:r>
+        <w:rPr>
+          <w:b/>
+          <w:bCs/>
+        </w:rPr>
+        <w:t>Embedding:-</w:t>
+      </w:r>
+      <w:r>
+        <w:t xml:space="preserve">  A list of Numbers – called vector – that  represents the meaning of words,sentences, so computer can understand.</w:t>
+      </w:r>
+    </w:p>
+    <w:p>
+      <w:r>
+        <w:rPr>
+          <w:b/>
+          <w:bCs/>
+        </w:rPr>
+        <w:t>Vector Databaase:-</w:t>
+      </w:r>
+      <w:r>
+        <w:t xml:space="preserve">  is a place where we store the vectors.</w:t>
+      </w:r>
+    </w:p>
+    <w:p>
+      <w:r>
+        <w:rPr>
+          <w:b/>
+          <w:bCs/>
+        </w:rPr>
+        <w:t>LLM:-</w:t>
+      </w:r>
+      <w:r>
+        <w:t xml:space="preserve"> Is an language Model that is used to generate text ( called as Generator Component)</w:t>
+      </w:r>
+    </w:p>
+    <w:p/>
+    <w:p>
+      <w:r>
+        <w:rPr>
+          <w:b/>
+          <w:bCs/>
+        </w:rPr>
+        <w:t>RAG:-</w:t>
+      </w:r>
+      <w:r>
+        <w:t xml:space="preserve">  Retreival Augment Generation is AI technqiue that connects a LLM model to an external knowledge base so that it can give accurate, up to date answer</w:t>
+      </w:r>
+    </w:p>
+    <w:p>
+      <w:pPr>
+        <w:pStyle w:val="ListParagraph"/>
+        <w:numPr>
+          <w:ilvl w:val="0"/>
+          <w:numId w:val="1"/>
+        </w:numPr>
+      </w:pPr>
+      <w:r>
+        <w:t>RAG is not llm, it is an architecture ..</w:t>
+      </w:r>
+    </w:p>
+    <w:p>
+      <w:pPr>
+        <w:pStyle w:val="ListParagraph"/>
+      </w:pPr>
+    </w:p>
+    <w:p/>
+    <w:p/>
+    <w:p/>
+    <w:p/>
+    <w:p/>
+    <w:p/>
+    <w:p/>
+    <w:p/>
+    <w:p/>
+    <w:p/>
+    <w:p/>
+    <w:p/>
+    <w:p/>
+    <w:p/>
+    <w:p/>
+    <w:p/>
+    <w:p/>
+    <w:p/>
+    <w:p/>
+    <w:p/>
+    <w:p/>
+    <w:p/>
+    <w:p/>
+    <w:p/>
+    <w:p/>
+    <w:p/>
+    <w:p/>
+    <w:p/>
+    <w:p/>
+    <w:p/>
+    <w:p/>
+    <w:p/>
+    <w:p/>
+    <w:p/>
+    <w:p/>
+    <w:p/>
+    <w:p/>
+    <w:p/>
+    <w:p/>
+    <w:p/>
+    <w:p/>
+    <w:p/>
+    <w:p/>
+    <w:p/>
+    <w:p/>
+    <w:p/>
+    <w:p>
+      <w:r>
+        <w:rPr>
+          <w:noProof/>
+        </w:rPr>
+        <w:lastRenderedPageBreak/>
         <w:drawing>
           <wp:inline distT="0" distB="0" distL="0" distR="0" wp14:anchorId="43FD6C4E" wp14:editId="68538625">
             <wp:extent cx="5731510" cy="4015105"/>
@@ -20,7 +200,7 @@
                     <pic:cNvPicPr/>
                   </pic:nvPicPr>
                   <pic:blipFill>
-                    <a:blip r:embed="rId4"/>
+                    <a:blip r:embed="rId5"/>
                     <a:stretch>
                       <a:fillRect/>
                     </a:stretch>
@@ -52,6 +232,126 @@
     </w:sectPr>
   </w:body>
 </w:document>
+</file>
+
+<file path=word/numbering.xml><?xml version="1.0" encoding="utf-8"?>
+<w:numbering xmlns:wpc="http://schemas.microsoft.com/office/word/2010/wordprocessingCanvas" xmlns:cx="http://schemas.microsoft.com/office/drawing/2014/chartex" xmlns:cx1="http://schemas.microsoft.com/office/drawing/2015/9/8/chartex" xmlns:cx2="http://schemas.microsoft.com/office/drawing/2015/10/21/chartex" xmlns:cx3="http://schemas.microsoft.com/office/drawing/2016/5/9/chartex" xmlns:cx4="http://schemas.microsoft.com/office/drawing/2016/5/10/chartex" xmlns:cx5="http://schemas.microsoft.com/office/drawing/2016/5/11/chartex" xmlns:cx6="http://schemas.microsoft.com/office/drawing/2016/5/12/chartex" xmlns:cx7="http://schemas.microsoft.com/office/drawing/2016/5/13/chartex" xmlns:cx8="http://schemas.microsoft.com/office/drawing/2016/5/14/chartex" xmlns:mc="http://schemas.openxmlformats.org/markup-compatibility/2006" xmlns:aink="http://schemas.microsoft.com/office/drawing/2016/ink" xmlns:am3d="http://schemas.microsoft.com/office/drawing/2017/model3d" xmlns:o="urn:schemas-microsoft-com:office:office" xmlns:oel="http://schemas.microsoft.com/office/2019/extlst" xmlns:r="http://schemas.openxmlformats.org/officeDocument/2006/relationships" xmlns:m="http://schemas.openxmlformats.org/officeDocument/2006/math" xmlns:v="urn:schemas-microsoft-com:vml" xmlns:wp14="http://schemas.microsoft.com/office/word/2010/wordprocessingDrawing" xmlns:wp="http://schemas.openxmlformats.org/drawingml/2006/wordprocessingDrawing" xmlns:w10="urn:schemas-microsoft-com:office:word" xmlns:w="http://schemas.openxmlformats.org/wordprocessingml/2006/main" xmlns:w14="http://schemas.microsoft.com/office/word/2010/wordml" xmlns:w15="http://schemas.microsoft.com/office/word/2012/wordml" xmlns:w16cex="http://schemas.microsoft.com/office/word/2018/wordml/cex" xmlns:w16cid="http://schemas.microsoft.com/office/word/2016/wordml/cid" xmlns:w16="http://schemas.microsoft.com/office/word/2018/wordml" xmlns:w16du="http://schemas.microsoft.com/office/word/2023/wordml/word16du" xmlns:w16sdtdh="http://schemas.microsoft.com/office/word/2020/wordml/sdtdatahash" xmlns:w16sdtfl="http://schemas.microsoft.com/office/word/2024/wordml/sdtformatlock" xmlns:w16se="http://schemas.microsoft.com/office/word/2015/wordml/symex" xmlns:wpg="http://schemas.microsoft.com/office/word/2010/wordprocessingGroup" xmlns:wpi="http://schemas.microsoft.com/office/word/2010/wordprocessingInk" xmlns:wne="http://schemas.microsoft.com/office/word/2006/wordml" xmlns:wps="http://schemas.microsoft.com/office/word/2010/wordprocessingShape" mc:Ignorable="w14 w15 w16se w16cid w16 w16cex w16sdtdh w16sdtfl w16du wp14">
+  <w:abstractNum w:abstractNumId="0" w15:restartNumberingAfterBreak="0">
+    <w:nsid w:val="79AC0D9D"/>
+    <w:multiLevelType w:val="hybridMultilevel"/>
+    <w:tmpl w:val="AE1869F2"/>
+    <w:lvl w:ilvl="0" w:tplc="BFDCF000">
+      <w:numFmt w:val="bullet"/>
+      <w:lvlText w:val=""/>
+      <w:lvlJc w:val="left"/>
+      <w:pPr>
+        <w:ind w:left="720" w:hanging="360"/>
+      </w:pPr>
+      <w:rPr>
+        <w:rFonts w:ascii="Wingdings" w:eastAsiaTheme="minorHAnsi" w:hAnsi="Wingdings" w:cstheme="minorBidi" w:hint="default"/>
+      </w:rPr>
+    </w:lvl>
+    <w:lvl w:ilvl="1" w:tplc="40090003" w:tentative="1">
+      <w:start w:val="1"/>
+      <w:numFmt w:val="bullet"/>
+      <w:lvlText w:val="o"/>
+      <w:lvlJc w:val="left"/>
+      <w:pPr>
+        <w:ind w:left="1440" w:hanging="360"/>
+      </w:pPr>
+      <w:rPr>
+        <w:rFonts w:ascii="Courier New" w:hAnsi="Courier New" w:cs="Courier New" w:hint="default"/>
+      </w:rPr>
+    </w:lvl>
+    <w:lvl w:ilvl="2" w:tplc="40090005" w:tentative="1">
+      <w:start w:val="1"/>
+      <w:numFmt w:val="bullet"/>
+      <w:lvlText w:val=""/>
+      <w:lvlJc w:val="left"/>
+      <w:pPr>
+        <w:ind w:left="2160" w:hanging="360"/>
+      </w:pPr>
+      <w:rPr>
+        <w:rFonts w:ascii="Wingdings" w:hAnsi="Wingdings" w:hint="default"/>
+      </w:rPr>
+    </w:lvl>
+    <w:lvl w:ilvl="3" w:tplc="40090001" w:tentative="1">
+      <w:start w:val="1"/>
+      <w:numFmt w:val="bullet"/>
+      <w:lvlText w:val=""/>
+      <w:lvlJc w:val="left"/>
+      <w:pPr>
+        <w:ind w:left="2880" w:hanging="360"/>
+      </w:pPr>
+      <w:rPr>
+        <w:rFonts w:ascii="Symbol" w:hAnsi="Symbol" w:hint="default"/>
+      </w:rPr>
+    </w:lvl>
+    <w:lvl w:ilvl="4" w:tplc="40090003" w:tentative="1">
+      <w:start w:val="1"/>
+      <w:numFmt w:val="bullet"/>
+      <w:lvlText w:val="o"/>
+      <w:lvlJc w:val="left"/>
+      <w:pPr>
+        <w:ind w:left="3600" w:hanging="360"/>
+      </w:pPr>
+      <w:rPr>
+        <w:rFonts w:ascii="Courier New" w:hAnsi="Courier New" w:cs="Courier New" w:hint="default"/>
+      </w:rPr>
+    </w:lvl>
+    <w:lvl w:ilvl="5" w:tplc="40090005" w:tentative="1">
+      <w:start w:val="1"/>
+      <w:numFmt w:val="bullet"/>
+      <w:lvlText w:val=""/>
+      <w:lvlJc w:val="left"/>
+      <w:pPr>
+        <w:ind w:left="4320" w:hanging="360"/>
+      </w:pPr>
+      <w:rPr>
+        <w:rFonts w:ascii="Wingdings" w:hAnsi="Wingdings" w:hint="default"/>
+      </w:rPr>
+    </w:lvl>
+    <w:lvl w:ilvl="6" w:tplc="40090001" w:tentative="1">
+      <w:start w:val="1"/>
+      <w:numFmt w:val="bullet"/>
+      <w:lvlText w:val=""/>
+      <w:lvlJc w:val="left"/>
+      <w:pPr>
+        <w:ind w:left="5040" w:hanging="360"/>
+      </w:pPr>
+      <w:rPr>
+        <w:rFonts w:ascii="Symbol" w:hAnsi="Symbol" w:hint="default"/>
+      </w:rPr>
+    </w:lvl>
+    <w:lvl w:ilvl="7" w:tplc="40090003" w:tentative="1">
+      <w:start w:val="1"/>
+      <w:numFmt w:val="bullet"/>
+      <w:lvlText w:val="o"/>
+      <w:lvlJc w:val="left"/>
+      <w:pPr>
+        <w:ind w:left="5760" w:hanging="360"/>
+      </w:pPr>
+      <w:rPr>
+        <w:rFonts w:ascii="Courier New" w:hAnsi="Courier New" w:cs="Courier New" w:hint="default"/>
+      </w:rPr>
+    </w:lvl>
+    <w:lvl w:ilvl="8" w:tplc="40090005" w:tentative="1">
+      <w:start w:val="1"/>
+      <w:numFmt w:val="bullet"/>
+      <w:lvlText w:val=""/>
+      <w:lvlJc w:val="left"/>
+      <w:pPr>
+        <w:ind w:left="6480" w:hanging="360"/>
+      </w:pPr>
+      <w:rPr>
+        <w:rFonts w:ascii="Wingdings" w:hAnsi="Wingdings" w:hint="default"/>
+      </w:rPr>
+    </w:lvl>
+  </w:abstractNum>
+  <w:num w:numId="1" w16cid:durableId="1175537981">
+    <w:abstractNumId w:val="0"/>
+  </w:num>
+</w:numbering>
 </file>
 
 <file path=word/styles.xml><?xml version="1.0" encoding="utf-8"?>
@@ -657,7 +957,6 @@
   <w:style w:type="character" w:default="1" w:styleId="DefaultParagraphFont">
     <w:name w:val="Default Paragraph Font"/>
     <w:uiPriority w:val="1"/>
-    <w:semiHidden/>
     <w:unhideWhenUsed/>
   </w:style>
   <w:style w:type="table" w:default="1" w:styleId="TableNormal">

</xml_diff>